<commit_message>
research: ecosystem map — Asmidal–CRE Annaba MRV/CBAM agreement (7 Sep 2026), first Algerian actor
Co-authored-by: arena-agent <297053741+arena-agent@users.noreply.github.com>
</commit_message>
<xml_diff>
--- a/research/cbam_algeria/Ecosystem_Map_AR.docx
+++ b/research/cbam_algeria/Ecosystem_Map_AR.docx
@@ -141,6 +141,449 @@
                 <w:sz w:val="21"/>
               </w:rPr>
               <w:t>3) بلغاريا فيها 7 محققي ETS فقط، ومنهم 3 محليون (G&amp;F، SGS Bulgaria، GMI Verify) و4 أجانب يعملون هناك (Emicert وEurocert اليونانيتان، Verifikace CZ وBureau Veritas التشيكيتان). أي أن بديلك الطبيعي في بلغاريا هو SGS Bulgaria (شهادة 11 OB، يناير 2026) — وSGS لها مكتب في الجزائر أصلاً. هذا هو "الشريك ب" الأقوى منطقياً.</w:t>
+            </w:r>
+          </w:p>
+        </w:tc>
+      </w:tr>
+    </w:tbl>
+    <w:p/>
+    <w:p>
+      <w:pPr>
+        <w:pStyle w:val="Heading1"/>
+        <w:jc w:val="right"/>
+        <w:bidi/>
+      </w:pPr>
+      <w:r>
+        <w:rPr>
+          <w:color w:val="A01E1E"/>
+        </w:rPr>
+        <w:t>0-bis. تحديث 22 سبتمبر: أول من بدأ فعلاً في الجزائر — وهو في عنابة</w:t>
+      </w:r>
+    </w:p>
+    <w:tbl>
+      <w:tblPr>
+        <w:tblW w:type="auto" w:w="0"/>
+        <w:tblLook w:firstColumn="1" w:firstRow="1" w:lastColumn="0" w:lastRow="0" w:noHBand="0" w:noVBand="1" w:val="04A0"/>
+        <w:bidiVisual/>
+      </w:tblPr>
+      <w:tblGrid>
+        <w:gridCol w:w="9972"/>
+      </w:tblGrid>
+      <w:tr>
+        <w:tc>
+          <w:tcPr>
+            <w:tcW w:type="dxa" w:w="9638"/>
+            <w:shd w:val="clear" w:color="auto" w:fill="FDECEC"/>
+          </w:tcPr>
+          <w:p>
+            <w:pPr>
+              <w:jc w:val="right"/>
+              <w:bidi/>
+            </w:pPr>
+            <w:r/>
+            <w:r>
+              <w:rPr>
+                <w:b/>
+                <w:color w:val="A01E1E"/>
+                <w:sz w:val="21"/>
+              </w:rPr>
+              <w:t>يوم 7 سبتمبر 2026 وقّع مجمع Asmidal (Sonatrach) في مقر Fertial اتفاقية-إطار لخمس سنوات + عقد تطبيقي مع مركز البحث في البيئة (CRE) بعنابة — مؤسسة عمومية علمية تابعة لوزارة التعليم العالي، مقرها داخل حرم جامعة باجي مختار (سيدي عمار). الموضوع: إنشاء نظام MRV (قياس/إبلاغ/تحقق) وفق ISO 14064:2018 في مصنعَي Fertial بعنابة وأرزيو "للاستجابة لمتطلبات CBAM وتأمين الصادرات نحو أوروبا". الموقّعان: PDG Asmidal محمد نور الدين بن قادة (جديد — خلف بطوش بوطوبة)، والمديرة العامة للمركز البروفيسورة زهاد (زيهاد) معمشة-بوسلامة (أستاذة إيكولوجيا، على رأس المركز منذ يناير 2019).</w:t>
+            </w:r>
+          </w:p>
+        </w:tc>
+      </w:tr>
+    </w:tbl>
+    <w:p/>
+    <w:p>
+      <w:pPr>
+        <w:jc w:val="right"/>
+        <w:bidi/>
+      </w:pPr>
+      <w:r>
+        <w:rPr>
+          <w:b/>
+          <w:i w:val="0"/>
+        </w:rPr>
+        <w:t>ماذا يعني هذا بدقة:</w:t>
+      </w:r>
+    </w:p>
+    <w:p>
+      <w:pPr>
+        <w:pStyle w:val="ListBullet"/>
+        <w:jc w:val="right"/>
+        <w:bidi/>
+      </w:pPr>
+      <w:r>
+        <w:rPr>
+          <w:b/>
+        </w:rPr>
+        <w:t xml:space="preserve">1. </w:t>
+      </w:r>
+      <w:r>
+        <w:t>الجزائر اختارت — دون إعلان — النموذج "الأكاديمي العمومي" لبناء MRV: مركز بحث جامعي لا مكتب استشارات ولا محقق أجنبي. هذا هو بالضبط النموذج الذي اقترحتَه للوزير (أكاديمية مدققين في جامعة) — لكن جامعة عنابة سبقت جامعة الطارف إليه بعقد موقّع مع أكبر مصدّر أسمدة.</w:t>
+      </w:r>
+    </w:p>
+    <w:p>
+      <w:pPr>
+        <w:pStyle w:val="ListBullet"/>
+        <w:jc w:val="right"/>
+        <w:bidi/>
+      </w:pPr>
+      <w:r>
+        <w:rPr>
+          <w:b/>
+        </w:rPr>
+        <w:t xml:space="preserve">2. </w:t>
+      </w:r>
+      <w:r>
+        <w:t>CRE يستطيع بناء نظام MRV والقياس، لكنه لا يستطيع إصدار رأي تحقق CBAM: ليس معتمداً ISO 14065/17029 لدى أي هيئة أوروبية، ولا يمكن أن يكون (مبدأ الاستقلالية: من يبني النظام لا يحققه). أي أن Fertial ستحتاج في 2027 محققاً أوروبياً معتمداً حتماً — وهذه هي فجوتك، لا فجوة CRE.</w:t>
+      </w:r>
+    </w:p>
+    <w:p>
+      <w:pPr>
+        <w:pStyle w:val="ListBullet"/>
+        <w:jc w:val="right"/>
+        <w:bidi/>
+      </w:pPr>
+      <w:r>
+        <w:rPr>
+          <w:b/>
+        </w:rPr>
+        <w:t xml:space="preserve">3. </w:t>
+      </w:r>
+      <w:r>
+        <w:t>هدفك الأول (Fertial) لم يعد "فارغاً": هناك الآن جهة عمومية وسيطة تملك العلاقة. الدخول إلى Fertial من الباب الأمامي بعد اليوم يعني الاصطدام بـ CRE؛ الدخول عبر CRE يعني الشراكة.</w:t>
+      </w:r>
+    </w:p>
+    <w:p>
+      <w:pPr>
+        <w:pStyle w:val="ListBullet"/>
+        <w:jc w:val="right"/>
+        <w:bidi/>
+      </w:pPr>
+      <w:r>
+        <w:rPr>
+          <w:b/>
+        </w:rPr>
+        <w:t xml:space="preserve">4. </w:t>
+      </w:r>
+      <w:r>
+        <w:t>الفرصة المعكوسة: CRE سيحتاج خلال 12 شهراً شريكاً يعرف قواعد التحقق الأوروبية (2018/2067، IR 2025/2546، 5% materiality) ومحققاً معتمداً يقبل تقرير MRV الذي يبنيه. أنت + محقق أوروبي = القطعة الناقصة في عقدهم. اعرض على البروفيسورة بوسلامة "اتفاقية جامعة-إلى-جامعة" (الطارف–عنابة) لا منافسة.</w:t>
+      </w:r>
+    </w:p>
+    <w:p>
+      <w:pPr>
+        <w:pStyle w:val="ListBullet"/>
+        <w:jc w:val="right"/>
+        <w:bidi/>
+      </w:pPr>
+      <w:r>
+        <w:rPr>
+          <w:b/>
+        </w:rPr>
+        <w:t xml:space="preserve">5. </w:t>
+      </w:r>
+      <w:r>
+        <w:t>أعد ترتيب خطواتك: (أ) إيميل رسمي من جامعة الطارف إلى CRE هذا الأسبوع يقترح لقاءً حول "التحقق المستقل المعتمد كمرحلة تالية لنظام MRV"؛ (ب) أخبر أنطون (أو Eurocert/RINA) بأن أول عقد MRV جزائري وُقّع وأن الطلب على محقق معتمد صار مؤكداً لعام 2027 — هذا يرفع قيمتك التفاوضية؛ (ج) في مذكرة الوزير، اذكر اتفاق Asmidal–CRE كدليل على أن "الحلقة الناقصة هي الاعتماد الأوروبي للتحقق، لا القياس".</w:t>
+      </w:r>
+    </w:p>
+    <w:tbl>
+      <w:tblPr>
+        <w:tblStyle w:val="TableGrid"/>
+        <w:tblW w:type="auto" w:w="0"/>
+        <w:tblLook w:firstColumn="1" w:firstRow="1" w:lastColumn="0" w:lastRow="0" w:noHBand="0" w:noVBand="1" w:val="04A0"/>
+        <w:bidiVisual/>
+      </w:tblPr>
+      <w:tblGrid>
+        <w:gridCol w:w="3324"/>
+        <w:gridCol w:w="3324"/>
+        <w:gridCol w:w="3324"/>
+      </w:tblGrid>
+      <w:tr>
+        <w:tc>
+          <w:tcPr>
+            <w:tcW w:type="dxa" w:w="2835"/>
+            <w:shd w:val="clear" w:color="auto" w:fill="1F3A5F"/>
+          </w:tcPr>
+          <w:p>
+            <w:pPr>
+              <w:jc w:val="right"/>
+              <w:bidi/>
+            </w:pPr>
+            <w:r/>
+            <w:r>
+              <w:rPr>
+                <w:b/>
+                <w:color w:val="FFFFFF"/>
+                <w:sz w:val="18"/>
+              </w:rPr>
+              <w:t>الجهة</w:t>
+            </w:r>
+          </w:p>
+        </w:tc>
+        <w:tc>
+          <w:tcPr>
+            <w:tcW w:type="dxa" w:w="2835"/>
+            <w:shd w:val="clear" w:color="auto" w:fill="1F3A5F"/>
+          </w:tcPr>
+          <w:p>
+            <w:pPr>
+              <w:jc w:val="right"/>
+              <w:bidi/>
+            </w:pPr>
+            <w:r/>
+            <w:r>
+              <w:rPr>
+                <w:b/>
+                <w:color w:val="FFFFFF"/>
+                <w:sz w:val="18"/>
+              </w:rPr>
+              <w:t>الأشخاص</w:t>
+            </w:r>
+          </w:p>
+        </w:tc>
+        <w:tc>
+          <w:tcPr>
+            <w:tcW w:type="dxa" w:w="3685"/>
+            <w:shd w:val="clear" w:color="auto" w:fill="1F3A5F"/>
+          </w:tcPr>
+          <w:p>
+            <w:pPr>
+              <w:jc w:val="right"/>
+              <w:bidi/>
+            </w:pPr>
+            <w:r/>
+            <w:r>
+              <w:rPr>
+                <w:b/>
+                <w:color w:val="FFFFFF"/>
+                <w:sz w:val="18"/>
+              </w:rPr>
+              <w:t>التقييم</w:t>
+            </w:r>
+          </w:p>
+        </w:tc>
+      </w:tr>
+      <w:tr>
+        <w:tc>
+          <w:tcPr>
+            <w:tcW w:type="dxa" w:w="2835"/>
+          </w:tcPr>
+          <w:p>
+            <w:pPr>
+              <w:jc w:val="right"/>
+              <w:bidi/>
+            </w:pPr>
+            <w:r/>
+            <w:r>
+              <w:rPr>
+                <w:sz w:val="18"/>
+              </w:rPr>
+              <w:t>CRE — مركز البحث في البيئة، عنابة (EPST، وزارة التعليم العالي/DGRSDT)</w:t>
+            </w:r>
+          </w:p>
+        </w:tc>
+        <w:tc>
+          <w:tcPr>
+            <w:tcW w:type="dxa" w:w="2835"/>
+          </w:tcPr>
+          <w:p>
+            <w:pPr>
+              <w:jc w:val="right"/>
+              <w:bidi/>
+            </w:pPr>
+            <w:r/>
+            <w:r>
+              <w:rPr>
+                <w:sz w:val="18"/>
+              </w:rPr>
+              <w:t>المديرة العامة: البروفيسورة زهاد معمشة-بوسلامة؛ باحثون: عيسى بن صلحوب وغيره (cre.dz)</w:t>
+            </w:r>
+          </w:p>
+        </w:tc>
+        <w:tc>
+          <w:tcPr>
+            <w:tcW w:type="dxa" w:w="3685"/>
+          </w:tcPr>
+          <w:p>
+            <w:pPr>
+              <w:jc w:val="right"/>
+              <w:bidi/>
+            </w:pPr>
+            <w:r/>
+            <w:r>
+              <w:rPr>
+                <w:sz w:val="18"/>
+              </w:rPr>
+              <w:t>أول فاعل جزائري بعقد MRV/CBAM موقّع. شريك لا منافس. غير معتمد للتحقق.</w:t>
+            </w:r>
+          </w:p>
+        </w:tc>
+      </w:tr>
+      <w:tr>
+        <w:tc>
+          <w:tcPr>
+            <w:tcW w:type="dxa" w:w="2835"/>
+          </w:tcPr>
+          <w:p>
+            <w:pPr>
+              <w:jc w:val="right"/>
+              <w:bidi/>
+            </w:pPr>
+            <w:r/>
+            <w:r>
+              <w:rPr>
+                <w:sz w:val="18"/>
+              </w:rPr>
+              <w:t>Asmidal (Sonatrach)</w:t>
+            </w:r>
+          </w:p>
+        </w:tc>
+        <w:tc>
+          <w:tcPr>
+            <w:tcW w:type="dxa" w:w="2835"/>
+          </w:tcPr>
+          <w:p>
+            <w:pPr>
+              <w:jc w:val="right"/>
+              <w:bidi/>
+            </w:pPr>
+            <w:r/>
+            <w:r>
+              <w:rPr>
+                <w:sz w:val="18"/>
+              </w:rPr>
+              <w:t>PDG الجديد: محمد نور الدين بن قادة</w:t>
+            </w:r>
+          </w:p>
+        </w:tc>
+        <w:tc>
+          <w:tcPr>
+            <w:tcW w:type="dxa" w:w="3685"/>
+          </w:tcPr>
+          <w:p>
+            <w:pPr>
+              <w:jc w:val="right"/>
+              <w:bidi/>
+            </w:pPr>
+            <w:r/>
+            <w:r>
+              <w:rPr>
+                <w:sz w:val="18"/>
+              </w:rPr>
+              <w:t>صاحب القرار الفعلي لـ Fertial. اختار مساراً عمومياً-أكاديمياً؛ سيقبل بسهولة جامعة ثانية.</w:t>
+            </w:r>
+          </w:p>
+        </w:tc>
+      </w:tr>
+      <w:tr>
+        <w:tc>
+          <w:tcPr>
+            <w:tcW w:type="dxa" w:w="2835"/>
+          </w:tcPr>
+          <w:p>
+            <w:pPr>
+              <w:jc w:val="right"/>
+              <w:bidi/>
+            </w:pPr>
+            <w:r/>
+            <w:r>
+              <w:rPr>
+                <w:sz w:val="18"/>
+              </w:rPr>
+              <w:t>Général Emballage (بجاية)</w:t>
+            </w:r>
+          </w:p>
+        </w:tc>
+        <w:tc>
+          <w:tcPr>
+            <w:tcW w:type="dxa" w:w="2835"/>
+          </w:tcPr>
+          <w:p>
+            <w:pPr>
+              <w:jc w:val="right"/>
+              <w:bidi/>
+            </w:pPr>
+            <w:r/>
+            <w:r>
+              <w:rPr>
+                <w:sz w:val="18"/>
+              </w:rPr>
+              <w:t>—</w:t>
+            </w:r>
+          </w:p>
+        </w:tc>
+        <w:tc>
+          <w:tcPr>
+            <w:tcW w:type="dxa" w:w="3685"/>
+          </w:tcPr>
+          <w:p>
+            <w:pPr>
+              <w:jc w:val="right"/>
+              <w:bidi/>
+            </w:pPr>
+            <w:r/>
+            <w:r>
+              <w:rPr>
+                <w:sz w:val="18"/>
+              </w:rPr>
+              <w:t>أول شركة جزائرية نشرت بصمة كربونية كاملة معتمدة GHG Protocol (2025). ليست في نطاق CBAM لكنها مرجع محلي.</w:t>
+            </w:r>
+          </w:p>
+        </w:tc>
+      </w:tr>
+      <w:tr>
+        <w:tc>
+          <w:tcPr>
+            <w:tcW w:type="dxa" w:w="2835"/>
+          </w:tcPr>
+          <w:p>
+            <w:pPr>
+              <w:jc w:val="right"/>
+              <w:bidi/>
+            </w:pPr>
+            <w:r/>
+            <w:r>
+              <w:rPr>
+                <w:sz w:val="18"/>
+              </w:rPr>
+              <w:t>SGS/BV/TÜV في الجزائر</w:t>
+            </w:r>
+          </w:p>
+        </w:tc>
+        <w:tc>
+          <w:tcPr>
+            <w:tcW w:type="dxa" w:w="2835"/>
+          </w:tcPr>
+          <w:p>
+            <w:pPr>
+              <w:jc w:val="right"/>
+              <w:bidi/>
+            </w:pPr>
+            <w:r/>
+            <w:r>
+              <w:rPr>
+                <w:sz w:val="18"/>
+              </w:rPr>
+              <w:t>—</w:t>
+            </w:r>
+          </w:p>
+        </w:tc>
+        <w:tc>
+          <w:tcPr>
+            <w:tcW w:type="dxa" w:w="3685"/>
+          </w:tcPr>
+          <w:p>
+            <w:pPr>
+              <w:jc w:val="right"/>
+              <w:bidi/>
+            </w:pPr>
+            <w:r/>
+            <w:r>
+              <w:rPr>
+                <w:sz w:val="18"/>
+              </w:rPr>
+              <w:t>لا أثر علنياً لأي عقد CBAM جزائري موقّع معهم حتى 22/09/2026.</w:t>
             </w:r>
           </w:p>
         </w:tc>
@@ -2681,7 +3124,7 @@
           <w:color w:val="555555"/>
           <w:sz w:val="15"/>
         </w:rPr>
-        <w:t>المصادر: eea.government.bg (قائمة المحققين وقائمة أفراد G&amp;F، يناير–مارس 2026) · taxation-customs.ec.europa.eu State-of-play CBAM accreditation (07/2026) · cbamguide.com (08/2026) · gmk.center (07/2026) · eeas.europa.eu/delegations/algeria (02/2026) · ecotimesdz.com 21/02/2026 · lalgerieaujourdhui.dz 18/02/2026 · taqathyplus.org · ptx-hub.org (06/2026) · alger16.dz / journal-lanation.com 04/2025 · fnh.ma 27/07/2026 (IMANOR) · sgs.com (fr-ma) · bureauveritas.fr · tuv.com · rina.org · emicert.com · seragazidogrulama.com (AURA/Eurocert) · tse.org.tr · liners.com/vircbam · danem-test.com · standards.iteh.ai.</w:t>
+        <w:t>المصادر: eea.government.bg (قائمة المحققين وقائمة أفراد G&amp;F، يناير–مارس 2026) · taxation-customs.ec.europa.eu State-of-play CBAM accreditation (07/2026) · cbamguide.com (08/2026) · gmk.center (07/2026) · eeas.europa.eu/delegations/algeria (02/2026) · ecotimesdz.com 21/02/2026 · lalgerieaujourdhui.dz 18/02/2026 · taqathyplus.org · ptx-hub.org (06/2026) · alger16.dz / journal-lanation.com 04/2025 · fnh.ma 27/07/2026 (IMANOR) · sgs.com (fr-ma) · bureauveritas.fr · tuv.com · rina.org · emicert.com · seragazidogrulama.com (AURA/Eurocert) · tse.org.tr · liners.com/vircbam · danem-test.com · standards.iteh.ai · algerie-eco.com 08/09/2026 · maghrebemergent.news 08/09/2026 و24/06/2025 · elwatan 18/01/2019 (تنصيب مديرة CRE).</w:t>
       </w:r>
     </w:p>
     <w:sectPr>

</xml_diff>